<commit_message>
Update published chess clock to 30+0.3
</commit_message>
<xml_diff>
--- a/docs/materials/rules.docx
+++ b/docs/materials/rules.docx
@@ -288,11 +288,7 @@
               <w:spacing w:after="0" w:line="240" w:lineRule="auto"/>
             </w:pPr>
             <w:r>
-              <w:rPr>
-                <w:rFonts w:ascii="Times New Roman" w:hAnsi="Times New Roman"/>
-                <w:sz w:val="21"/>
-              </w:rPr>
-              <w:t>10 seconds per game</w:t>
+              <w:t>30 seconds per game</w:t>
             </w:r>
           </w:p>
         </w:tc>
@@ -338,16 +334,8 @@
             </w:tcMar>
           </w:tcPr>
           <w:p>
-            <w:pPr>
-              <w:keepNext/>
-              <w:spacing w:after="0" w:line="240" w:lineRule="auto"/>
-            </w:pPr>
             <w:r>
-              <w:rPr>
-                <w:rFonts w:ascii="Times New Roman" w:hAnsi="Times New Roman"/>
-                <w:sz w:val="21"/>
-              </w:rPr>
-              <w:t>0.1 seconds</w:t>
+              <w:t>0.3 seconds</w:t>
             </w:r>
           </w:p>
         </w:tc>

</xml_diff>

<commit_message>
Freeze student Starter v1.1
</commit_message>
<xml_diff>
--- a/docs/materials/rules.docx
+++ b/docs/materials/rules.docx
@@ -9,6 +9,18 @@
       </w:pPr>
       <w:r>
         <w:t>Chess Competition Rules</w:t>
+      </w:r>
+    </w:p>
+    <w:p>
+      <w:pPr>
+        <w:jc w:val="center"/>
+      </w:pPr>
+      <w:r>
+        <w:rPr>
+          <w:i/>
+          <w:sz w:val="20"/>
+        </w:rPr>
+        <w:t>Rules version 1.2 - September 25, 2026</w:t>
       </w:r>
     </w:p>
     <w:p>

</xml_diff>